<commit_message>
Report: corrected figures after a full re-check; add check scripts and the M1 reproduction logs
</commit_message>
<xml_diff>
--- a/report/emelyanov_sergey_exam_report.docx
+++ b/report/emelyanov_sergey_exam_report.docx
@@ -68,7 +68,7 @@
         <w:spacing w:after="40"/>
       </w:pPr>
       <w:r>
-        <w:t>The task is to predict, for 1,260 sweet.tv users, the five programmes they will watch most often in weeks 31–42, scored by MAP@5 against a top-5 built from airings watched for at least 80 % of their length. I joined 5.82 M viewing intervals to the 10.8 % of schedule rows that carry a programme id, reproduced the organisers' answer rule on a weeks 11–20 → 21–30 hold-out, and compared a popularity baseline with personal frequency, Personalized PageRank (PPR), association rules, ALS matrix factorisation, item-kNN and content-based filtering before re-ranking their candidates with LightGBM. On the 1,150 test users with a full hold-out top-5, the best single method (PPR, α = 0.5) reaches MAP@5 0.394 and popularity 0.305, while the final hybrid ensemble reaches 0.447; on Kaggle it returned private 0.44801 (public 0.46135). On this platform, most of the signal is repeat viewing of the same news, kids' and entertainment shows, so a hybrid that keeps the user's own history as the backbone outperforms pure collaborative filtering.</w:t>
+        <w:t>The task is to predict, for 1,260 sweet.tv users, the five programmes they will watch most often in weeks 31–42, scored by MAP@5 against a top-5 built from airings watched for at least 80 % of their length. I joined 5.82 M viewing intervals to the 11 % of schedule rows that carry a programme id, reproduced the organisers' answer rule on a weeks 11–20 → 21–30 hold-out, and compared a popularity baseline with personal frequency, Personalized PageRank (PPR), association rules, ALS matrix factorisation, item-kNN and content-based filtering before re-ranking their candidates with LightGBM. On the 1,150 test users with a full hold-out top-5, the best single method (PPR, α = 0.5) reaches MAP@5 0.394 and popularity 0.305, while the final hybrid ensemble reaches 0.447; on Kaggle it returned private 0.44801 (public 0.46135). On this platform, most of the signal is repeat viewing of the same news, kids' and entertainment shows, so a hybrid that keeps the user's own history as the backbone outperforms pure collaborative filtering.</w:t>
       </w:r>
     </w:p>
     <w:p>
@@ -152,7 +152,7 @@
         <w:t>Motivation.</w:t>
       </w:r>
       <w:r>
-        <w:t xml:space="preserve"> My first local truth (any overlap ≥ 300 s) gave the popularity baseline MAP@5 0.727. That is far from the 0.4–0.46 range of real submissions, so the metric was not measuring the competition's target. With the official rule the same baseline scores 0.305, and the hold-out estimate of the first hybrid (0.440) landed near its Kaggle private score (0.448). Before tuning any model, the evaluation itself has to be validated.</w:t>
+        <w:t xml:space="preserve"> My first local truth (any overlap ≥ 300 s) gave the popularity baseline MAP@5 0.727. That is far from the 0.4–0.46 range of real submissions, so the metric was not measuring the competition's target. With the official rule the same baseline scores 0.305, and the hold-out estimate of the first submitted hybrid (0.439, attempt 22) landed near its Kaggle private score (0.448). Before tuning any model, the evaluation itself has to be validated.</w:t>
       </w:r>
     </w:p>
     <w:p>
@@ -863,7 +863,7 @@
           <w:i/>
           <w:sz w:val="16"/>
         </w:rPr>
-        <w:t>Table 1. Data accounting.</w:t>
+        <w:t>Table 1. Data accounting. The 145,041 test-window airings include 267 week-31 airings stored in the weeks 21–30 file.</w:t>
       </w:r>
     </w:p>
     <w:tbl>
@@ -1772,7 +1772,7 @@
           <w:i/>
           <w:sz w:val="16"/>
         </w:rPr>
-        <w:t>Table 2. Hold-out MAP@5 (history weeks 11–20 → truth weeks 21–30). All 124 attempts are listed in results/attempts_table.csv.</w:t>
+        <w:t>Table 2. Hold-out MAP@5 (history weeks 11–20 → truth weeks 21–30). All 124 attempts are listed in results/attempts_table.csv. Best setting = highest MAP@5 on all users; for PPR, α = 0.7 (#78) is equal within noise (0.396 / 0.361).</w:t>
       </w:r>
     </w:p>
     <w:p>
@@ -1855,7 +1855,7 @@
         <w:t>same</w:t>
       </w:r>
       <w:r>
-        <w:t xml:space="preserve"> programmes again. Personal frequency and PPR (whose restart keeps most mass on the user's own items when α ≥ 0.5) beat popularity by about 0.09. The hybrid adds a further +0.053, because it learns when a habit continues: recent weekly counts, catch rate and the number of target-window airings. Hyper-parameter changes after attempt 35 moved the score by at most ±0.005, the size of the noise.</w:t>
+        <w:t xml:space="preserve"> programmes again. Personal frequency and PPR (whose restart keeps most mass on the user's own items when α ≥ 0.5) beat popularity by about 0.09. The hybrid adds a further +0.053, because it learns when a habit continues: recent weekly counts, catch rate and the number of target-window airings. After attempt 35 (0.447 / 0.411), 57 further hybrid attempts (hyper-parameters, objectives, features, ensembles) changed the test-user score by −0.008 to +0.0002 and the all-user score by at most +0.002, within the noise.</w:t>
       </w:r>
     </w:p>
     <w:p>
@@ -2111,7 +2111,7 @@
         <w:t>Reproduction on a second machine (Table 4).</w:t>
       </w:r>
       <w:r>
-        <w:t xml:space="preserve"> The pipeline was re-run from a fresh clone twice on Linux x86-64 (by Claude Code) and once on my Apple M1 in a separate OpenCode session that I directed, with the same package versions. On Linux every number and the submission file are identical. On the M1, numpy uses Apple Accelerate instead of OpenBLAS; the last bits of the sparse AR and CBF products change, which reorders near-ties, gives a hybrid candidate frame of 763,658 rows instead of 763,617 and shifts LightGBM's splits.</w:t>
+        <w:t xml:space="preserve"> The pipeline was re-run from a fresh clone twice on Linux x86-64 (by Claude Code) and once on my Apple M1 in a separate OpenCode session that I directed, with the same package versions (Python 3.13.13 there, 3.13.16 here). On Linux every number and the submission file are identical. On the M1, numpy uses Apple Accelerate instead of OpenBLAS; the last bits of the sparse AR and CBF products change, which reorders near-ties, gives a hybrid candidate frame of 763,658 rows instead of 763,617 and shifts LightGBM's splits.</w:t>
       </w:r>
     </w:p>
     <w:tbl>
@@ -3542,7 +3542,7 @@
         <w:t>Готовим вместе</w:t>
       </w:r>
       <w:r>
-        <w:t xml:space="preserve">, which the user stopped watching. PPR's diffusion swaps it for </w:t>
+        <w:t xml:space="preserve">, which the user stopped watching. PPR's diffusion drops it (and Свинка Пеппа) for </w:t>
       </w:r>
       <w:r>
         <w:rPr>
@@ -3551,7 +3551,7 @@
         <w:t>Сегодня. Итоги</w:t>
       </w:r>
       <w:r>
-        <w:t xml:space="preserve">, a show co-watched by similar viewers, which was in the truth. The hybrid also uses the target-window schedule and recent weeks, and it recovers all five. Association rules and ALS see the kids' cluster (Свинка Пеппа → Вспыш) and so capture household co-viewing. CBF only matches attributes (news → news), which helps where co-view signal is thin. For the light user every method shares the same two hits, the national news shows that popularity already provides. Only three of the five true programmes are among the user's 192 candidates: the two films are not, so 0.600 is the ceiling, and the hybrid reaches 0.400. The third reachable programme, Вечерний квартал, has a single 105 s touch of a 6,600 s airing in the history, too weak to rank it. The lists are mostly </w:t>
+        <w:t xml:space="preserve">, a show co-watched by similar viewers, which was in the truth, and puts its four hits first (0.800). The hybrid also uses the target-window schedule and recent weeks, and it recovers all five. Association rules and ALS see the kids' cluster (Свинка Пеппа → Вспыш) and so capture household co-viewing. CBF only matches attributes (news → news), which helps where co-view signal is thin. For the light user every method shares the same two hits, the national news shows that popularity already provides. Only three of the five true programmes are among the user's 192 candidates: the two films are not, so 0.600 is the ceiling, and the hybrid reaches 0.400. The third reachable programme, Вечерний квартал, has a single 105 s touch of a 6,600 s airing in the history, too weak to rank it. The lists are mostly </w:t>
       </w:r>
       <w:r>
         <w:rPr>
@@ -3679,7 +3679,7 @@
         <w:t>more</w:t>
       </w:r>
       <w:r>
-        <w:t xml:space="preserve"> like personal frequency. (2) Generators find but cannot order: 78.6 % of a test user's true top-5 is already in their own weeks 11–20 history, and ALS holds the most of it in its top-30 (recall 0.716, PPR 0.707, popularity 0.655) but the least in its top-5 (0.327 against 0.456 for PPR). So the generators are used only for candidates, and the re-ranker decides the order. (3) The ensemble's gain over its best component (+0.0009 over #107) is smaller than the spread between machines (up to 0.0018): on the M1, #121 alone scores above #123. Habit features, DART, lambdarank and extra hyper-parameter search did not beat the plain binary objective beyond noise.</w:t>
+        <w:t xml:space="preserve"> like personal frequency. (2) Generators find but cannot order: 78.6 % of a test user's true top-5 is already in their own weeks 11–20 history, and ALS has the highest recall of the true top-5 in its top-30 (0.716; PPR 0.707, popularity 0.655) but only 0.327 in its top-5, against 0.456 for PPR. So the generators are used only for candidates, and the re-ranker decides the order. (3) The ensemble's gain over its best component (+0.0009 over #107) is smaller than the spread between machines (up to 0.0018): on the M1, #121 alone scores above #123. Habit features, DART, lambdarank and extra hyper-parameter search did not beat the plain binary objective beyond noise.</w:t>
       </w:r>
     </w:p>
     <w:p>
@@ -3693,7 +3693,7 @@
         <w:t>Limitations supported by the results.</w:t>
       </w:r>
       <w:r>
-        <w:t xml:space="preserve"> Only 10.8 % of schedule rows carry an id, so most viewing time is invisible to every method. 85.2 % candidate recall caps the hybrid. With a perfect ordering of the candidates by true future count, MAP@5 is 0.851 when ties are broken as in my truth and 0.776 when they are broken randomly; part of the score therefore depends on the organisers' unpublished tie rule. 4.3 % of test-window airings carry programme ids never seen before (new season), which the hybrid can reach only through popularity or CBF. The defensible claim is the ordering hybrid &gt; single methods &gt; popularity, which holds on both machines and on Kaggle (one concordant pair: +0.00045 private), not the third decimal. The log covers this platform's views only, so absence from it does not mean a user never saw a programme, and nothing here shows that users enjoyed what they watched. No online test was run, and no revenue claim is made.</w:t>
+        <w:t xml:space="preserve"> Only about 11 % of schedule rows carry an id (10.8–11.3 % per file), so most viewing time is invisible to every method. 85.2 % candidate recall caps the hybrid. With a perfect ordering of the candidates by true future count, MAP@5 is 0.851 when ties are broken as in my truth and 0.776 when they are broken randomly; part of the score therefore depends on the organisers' unpublished tie rule. 4.3 % of test-window airings carry programme ids never seen before (new season), which the hybrid can reach only through popularity or CBF. The defensible claim is the ordering hybrid &gt; single methods &gt; popularity, which holds on both machines and on Kaggle (one concordant pair: +0.00045 private), not the third decimal. The log covers this platform's views only, so absence from it does not mean a user never saw a programme, and nothing here shows that users enjoyed what they watched. No online test was run, and no revenue claim is made.</w:t>
       </w:r>
     </w:p>
     <w:p>
@@ -3890,7 +3890,7 @@
         <w:t>emelyanov_sergey_exam_opencode_session.json</w:t>
       </w:r>
       <w:r>
-        <w:t xml:space="preserve"> (OpenCode session ses_e95aa2d45ffelUbzQd00ghZrWQ of 2026-10-23, the reproduction in Table 4; its logs in </w:t>
+        <w:t xml:space="preserve"> (OpenCode session ses_e95aa2d45ffelUbzQd00ghZrWQ of 2026-10-23, the reproduction in Table 4; its logs and check scripts are in </w:t>
       </w:r>
       <w:r>
         <w:rPr>
@@ -3900,7 +3900,17 @@
         <w:t>results/oc/</w:t>
       </w:r>
       <w:r>
-        <w:t xml:space="preserve"> are not committed, this report carries their numbers).</w:t>
+        <w:t xml:space="preserve"> and </w:t>
+      </w:r>
+      <w:r>
+        <w:rPr>
+          <w:rFonts w:ascii="Consolas" w:hAnsi="Consolas"/>
+          <w:sz w:val="17"/>
+        </w:rPr>
+        <w:t>checks/</w:t>
+      </w:r>
+      <w:r>
+        <w:t>).</w:t>
       </w:r>
     </w:p>
     <w:p>

</xml_diff>

<commit_message>
Report: session log paragraph lists the submitted OpenCode session
</commit_message>
<xml_diff>
--- a/report/emelyanov_sergey_exam_report.docx
+++ b/report/emelyanov_sergey_exam_report.docx
@@ -3867,20 +3867,10 @@
         <w:rPr>
           <w:b/>
         </w:rPr>
-        <w:t>Session logs.</w:t>
+        <w:t>Session log.</w:t>
       </w:r>
       <w:r>
-        <w:t xml:space="preserve"> Both sessions are submitted unmodified: </w:t>
-      </w:r>
-      <w:r>
-        <w:rPr>
-          <w:rFonts w:ascii="Consolas" w:hAnsi="Consolas"/>
-          <w:sz w:val="17"/>
-        </w:rPr>
-        <w:t>emelyanov_sergey_exam_session.jsonl</w:t>
-      </w:r>
-      <w:r>
-        <w:t xml:space="preserve"> (Claude Code: development, the 124 attempts, both submissions, this report) and </w:t>
+        <w:t xml:space="preserve"> Submitted unmodified: </w:t>
       </w:r>
       <w:r>
         <w:rPr>

</xml_diff>

<commit_message>
Report lists both AI sessions; add an English summary of the Claude Code session
</commit_message>
<xml_diff>
--- a/report/emelyanov_sergey_exam_report.docx
+++ b/report/emelyanov_sergey_exam_report.docx
@@ -3867,10 +3867,30 @@
         <w:rPr>
           <w:b/>
         </w:rPr>
-        <w:t>Session log.</w:t>
+        <w:t>Session logs.</w:t>
       </w:r>
       <w:r>
-        <w:t xml:space="preserve"> Submitted unmodified: </w:t>
+        <w:t xml:space="preserve"> Both sessions are submitted: </w:t>
+      </w:r>
+      <w:r>
+        <w:rPr>
+          <w:rFonts w:ascii="Consolas" w:hAnsi="Consolas"/>
+          <w:sz w:val="17"/>
+        </w:rPr>
+        <w:t>emelyanov_sergey_exam_session.jsonl</w:t>
+      </w:r>
+      <w:r>
+        <w:t xml:space="preserve"> (Claude Code: development, the 124 attempts, both submissions, this report; an English summary is in </w:t>
+      </w:r>
+      <w:r>
+        <w:rPr>
+          <w:rFonts w:ascii="Consolas" w:hAnsi="Consolas"/>
+          <w:sz w:val="17"/>
+        </w:rPr>
+        <w:t>docs/ai_session_summary.md</w:t>
+      </w:r>
+      <w:r>
+        <w:t xml:space="preserve">) and </w:t>
       </w:r>
       <w:r>
         <w:rPr>
@@ -3880,7 +3900,7 @@
         <w:t>emelyanov_sergey_exam_opencode_session.json</w:t>
       </w:r>
       <w:r>
-        <w:t xml:space="preserve"> (OpenCode session ses_e95aa2d45ffelUbzQd00ghZrWQ of 2026-10-23, the reproduction in Table 4; its logs and check scripts are in </w:t>
+        <w:t xml:space="preserve"> (OpenCode session ses_e95aa2d45ffelUbzQd00ghZrWQ of 2026-10-23, the reproduction in Table 4, unmodified; its logs and check scripts are in </w:t>
       </w:r>
       <w:r>
         <w:rPr>
@@ -3900,7 +3920,7 @@
         <w:t>checks/</w:t>
       </w:r>
       <w:r>
-        <w:t>).</w:t>
+        <w:t>). In the Claude Code export only two personal e-mail addresses and expired Kaggle web-analytics tokens are masked; nothing else is changed.</w:t>
       </w:r>
     </w:p>
     <w:p>

</xml_diff>

<commit_message>
Report: Claude Code session submitted as JSON (emelyanov_sergey_exam_claude_session.json)
</commit_message>
<xml_diff>
--- a/report/emelyanov_sergey_exam_report.docx
+++ b/report/emelyanov_sergey_exam_report.docx
@@ -3877,7 +3877,7 @@
           <w:rFonts w:ascii="Consolas" w:hAnsi="Consolas"/>
           <w:sz w:val="17"/>
         </w:rPr>
-        <w:t>emelyanov_sergey_exam_session.jsonl</w:t>
+        <w:t>emelyanov_sergey_exam_claude_session.json</w:t>
       </w:r>
       <w:r>
         <w:t xml:space="preserve"> (Claude Code: development, the 124 attempts, both submissions, this report; an English summary is in </w:t>
@@ -3920,7 +3920,7 @@
         <w:t>checks/</w:t>
       </w:r>
       <w:r>
-        <w:t>). In the Claude Code export only two personal e-mail addresses and expired Kaggle web-analytics tokens are masked; nothing else is changed.</w:t>
+        <w:t>). The Claude Code export is the session's JSONL records as one JSON array; only two personal e-mail addresses and expired Kaggle web-analytics tokens are masked, nothing else is changed.</w:t>
       </w:r>
     </w:p>
     <w:p>

</xml_diff>